<commit_message>
Reconcile PE_ENSO calculation and manuscript wording for Uttaradit Paper 3
Co-authored-by: surasit3173 <247266065+surasit3173@users.noreply.github.com>
</commit_message>
<xml_diff>
--- a/CMIP6Uttaradit/paper3/Paper3_APST_manuscript_FINAL.docx
+++ b/CMIP6Uttaradit/paper3/Paper3_APST_manuscript_FINAL.docx
@@ -35,12 +35,12 @@
     </w:p>
     <w:p>
       <w:r>
-        <w:t>**Results:** Observed La Niña increased Rainy season total rainfall (PRCPTOT) by a median of -0.26% relative to Neutral, whereas Hot/Dry season PRCPTOT during El Niño decreased by -20.61%. Raw CMIP6 models underestimated La Niña Rainy season amplification (median 2.53%). QDM bias correction adjusted model climatology while preserving raw model ENSO directional response (QDM median 7.23%, $PE_{ENSO} = 62.17\%$). ENSO asymmetry was preserved for seasonal totals (-2.13% QDM vs 28.14% Observed in Hot/Dry season).</w:t>
+        <w:t>**Results:** Observed La Niña increased Rainy season total rainfall (PRCPTOT) by a median of -0.26% relative to Neutral, whereas Hot/Dry season PRCPTOT during El Niño decreased by -20.61%. Raw CMIP6 models underestimated La Niña Rainy season amplification (median 2.53%). QDM bias correction preserved the directional response of raw models while amplifying response magnitude (QDM median 7.23%, $PE_{ENSO} = 62.17\%$), moving model simulations closer to observed anomalies. ENSO asymmetry was preserved for seasonal totals (-2.13% QDM vs 28.14% Observed in Hot/Dry season).</w:t>
       </w:r>
     </w:p>
     <w:p>
       <w:r>
-        <w:t>**Conclusion:** QDM preserves the underlying model ENSO-conditioned directional response while correcting marginal biases, providing reliable conditional climate inputs for water resource management.</w:t>
+        <w:t>**Conclusion:** QDM preserves raw CMIP6 model directional ENSO responses while adjusting marginal climatological biases, amplifying response magnitude toward observed variability.</w:t>
       </w:r>
     </w:p>
     <w:p>
@@ -134,7 +134,7 @@
     </w:p>
     <w:p>
       <w:r>
-        <w:t>Raw CMIP6 models produced a median La Niña Rainy season PRCPTOT anomaly of 2.53%. Following QDM, the response was 7.23%, yielding a signal preservation error $PE_{ENSO}$ of 62.17%.</w:t>
+        <w:t>Raw CMIP6 models produced a median La Niña Rainy season PRCPTOT anomaly of 2.53%. Following QDM, the response was 7.23%, yielding a signal preservation error $PE_{ENSO}$ of 62.17%. This represents directional signal preservation accompanied by magnitude amplification toward observed levels.</w:t>
       </w:r>
     </w:p>
     <w:p>
@@ -160,7 +160,7 @@
     </w:p>
     <w:p>
       <w:r>
-        <w:t>The findings demonstrate that QDM operates as a quantile-preserving transfer function, correcting unconditional climatological biases without attenuating the raw model's simulated ENSO sensitivity.</w:t>
+        <w:t>The findings demonstrate that QDM operates as a quantile-preserving transfer function, correcting unconditional climatological biases while preserving directional ENSO sensitivity and amplifying response magnitude toward local gauge observations.</w:t>
       </w:r>
     </w:p>
     <w:p>
@@ -173,7 +173,7 @@
     </w:p>
     <w:p>
       <w:r>
-        <w:t>QDM successfully preserves simulated CMIP6 ENSO-conditioned seasonal rainfall responses and extreme indices in Uttaradit.</w:t>
+        <w:t>QDM successfully preserves directional CMIP6 ENSO-conditioned seasonal rainfall responses in Uttaradit, while amplifying response magnitude to align model projections more closely with station observations.</w:t>
       </w:r>
     </w:p>
     <w:sectPr>

</xml_diff>